<commit_message>
[FEAT] ajustes gerais ferramentas
</commit_message>
<xml_diff>
--- a/tests/Guia_Comandos_Automacao_Prazzu_Tools.docx
+++ b/tests/Guia_Comandos_Automacao_Prazzu_Tools.docx
@@ -6,106 +6,13 @@
       <w:pPr>
         <w:pStyle w:val="Ttulo1"/>
       </w:pPr>
-      <w:proofErr w:type="spellStart"/>
       <w:r>
-        <w:t>Guia</w:t>
-      </w:r>
-      <w:proofErr w:type="spellEnd"/>
-      <w:r>
-        <w:t xml:space="preserve"> de </w:t>
-      </w:r>
-      <w:proofErr w:type="spellStart"/>
-      <w:r>
-        <w:t>Comandos</w:t>
-      </w:r>
-      <w:proofErr w:type="spellEnd"/>
-      <w:r>
-        <w:t xml:space="preserve"> da </w:t>
-      </w:r>
-      <w:proofErr w:type="spellStart"/>
-      <w:r>
-        <w:t>Automação</w:t>
-      </w:r>
-      <w:proofErr w:type="spellEnd"/>
-      <w:r>
-        <w:t xml:space="preserve"> - </w:t>
-      </w:r>
-      <w:proofErr w:type="spellStart"/>
-      <w:r>
-        <w:t>Prazzu</w:t>
-      </w:r>
-      <w:proofErr w:type="spellEnd"/>
-      <w:r>
-        <w:t xml:space="preserve"> Tools</w:t>
+        <w:t>Guia de Comandos da Automação - Prazzu Tools</w:t>
       </w:r>
     </w:p>
     <w:p>
       <w:r>
-        <w:t xml:space="preserve">Este </w:t>
-      </w:r>
-      <w:proofErr w:type="spellStart"/>
-      <w:r>
-        <w:t>documento</w:t>
-      </w:r>
-      <w:proofErr w:type="spellEnd"/>
-      <w:r>
-        <w:t xml:space="preserve"> </w:t>
-      </w:r>
-      <w:proofErr w:type="spellStart"/>
-      <w:r>
-        <w:t>reúne</w:t>
-      </w:r>
-      <w:proofErr w:type="spellEnd"/>
-      <w:r>
-        <w:t xml:space="preserve"> </w:t>
-      </w:r>
-      <w:proofErr w:type="spellStart"/>
-      <w:r>
-        <w:t>os</w:t>
-      </w:r>
-      <w:proofErr w:type="spellEnd"/>
-      <w:r>
-        <w:t xml:space="preserve"> </w:t>
-      </w:r>
-      <w:proofErr w:type="spellStart"/>
-      <w:r>
-        <w:t>principais</w:t>
-      </w:r>
-      <w:proofErr w:type="spellEnd"/>
-      <w:r>
-        <w:t xml:space="preserve"> </w:t>
-      </w:r>
-      <w:proofErr w:type="spellStart"/>
-      <w:r>
-        <w:t>comandos</w:t>
-      </w:r>
-      <w:proofErr w:type="spellEnd"/>
-      <w:r>
-        <w:t xml:space="preserve"> da </w:t>
-      </w:r>
-      <w:proofErr w:type="spellStart"/>
-      <w:r>
-        <w:t>automação</w:t>
-      </w:r>
-      <w:proofErr w:type="spellEnd"/>
-      <w:r>
-        <w:t xml:space="preserve"> E2E e </w:t>
-      </w:r>
-      <w:proofErr w:type="spellStart"/>
-      <w:r>
-        <w:t>sua</w:t>
-      </w:r>
-      <w:proofErr w:type="spellEnd"/>
-      <w:r>
-        <w:t xml:space="preserve"> </w:t>
-      </w:r>
-      <w:proofErr w:type="spellStart"/>
-      <w:r>
-        <w:t>finalidade</w:t>
-      </w:r>
-      <w:proofErr w:type="spellEnd"/>
-      <w:r>
-        <w:t>.</w:t>
+        <w:t>Este documento reúne os principais comandos da automação E2E e sua finalidade.</w:t>
       </w:r>
       <w:r>
         <w:br/>
@@ -115,61 +22,28 @@
       <w:pPr>
         <w:pStyle w:val="Ttulo2"/>
       </w:pPr>
-      <w:proofErr w:type="spellStart"/>
       <w:r>
         <w:t>Preparação</w:t>
       </w:r>
-      <w:proofErr w:type="spellEnd"/>
     </w:p>
     <w:p>
-      <w:proofErr w:type="spellStart"/>
       <w:r>
         <w:rPr>
           <w:b/>
         </w:rPr>
-        <w:t>npm</w:t>
+        <w:t>npm install</w:t>
       </w:r>
-      <w:proofErr w:type="spellEnd"/>
+      <w:r>
+        <w:br/>
+        <w:t>Instala as dependências Node.js.</w:t>
+      </w:r>
+    </w:p>
+    <w:p>
       <w:r>
         <w:rPr>
           <w:b/>
         </w:rPr>
-        <w:t xml:space="preserve"> install</w:t>
-      </w:r>
-      <w:r>
-        <w:br/>
-      </w:r>
-      <w:proofErr w:type="spellStart"/>
-      <w:r>
-        <w:t>Instala</w:t>
-      </w:r>
-      <w:proofErr w:type="spellEnd"/>
-      <w:r>
-        <w:t xml:space="preserve"> as </w:t>
-      </w:r>
-      <w:proofErr w:type="spellStart"/>
-      <w:r>
-        <w:t>dependências</w:t>
-      </w:r>
-      <w:proofErr w:type="spellEnd"/>
-      <w:r>
-        <w:t xml:space="preserve"> Node.js.</w:t>
-      </w:r>
-    </w:p>
-    <w:p>
-      <w:proofErr w:type="spellStart"/>
-      <w:r>
-        <w:rPr>
-          <w:b/>
-        </w:rPr>
-        <w:t>npm</w:t>
-      </w:r>
-      <w:proofErr w:type="spellEnd"/>
-      <w:r>
-        <w:rPr>
-          <w:b/>
-        </w:rPr>
-        <w:t xml:space="preserve"> run e2</w:t>
+        <w:t>npm run e2</w:t>
       </w:r>
       <w:proofErr w:type="gramStart"/>
       <w:r>
@@ -187,30 +61,7 @@
       </w:r>
       <w:r>
         <w:br/>
-      </w:r>
-      <w:proofErr w:type="spellStart"/>
-      <w:r>
-        <w:t>Instala</w:t>
-      </w:r>
-      <w:proofErr w:type="spellEnd"/>
-      <w:r>
-        <w:t xml:space="preserve"> </w:t>
-      </w:r>
-      <w:proofErr w:type="spellStart"/>
-      <w:r>
-        <w:t>os</w:t>
-      </w:r>
-      <w:proofErr w:type="spellEnd"/>
-      <w:r>
-        <w:t xml:space="preserve"> </w:t>
-      </w:r>
-      <w:proofErr w:type="spellStart"/>
-      <w:r>
-        <w:t>navegadores</w:t>
-      </w:r>
-      <w:proofErr w:type="spellEnd"/>
-      <w:r>
-        <w:t xml:space="preserve"> Playwright (Chromium, Firefox e WebKit).</w:t>
+        <w:t>Instala os navegadores Playwright (Chromium, Firefox e WebKit).</w:t>
       </w:r>
     </w:p>
     <w:p>
@@ -230,38 +81,7 @@
       <w:proofErr w:type="gramEnd"/>
       <w:r>
         <w:br/>
-      </w:r>
-      <w:proofErr w:type="spellStart"/>
-      <w:r>
-        <w:t>Cria</w:t>
-      </w:r>
-      <w:proofErr w:type="spellEnd"/>
-      <w:r>
-        <w:t xml:space="preserve"> e </w:t>
-      </w:r>
-      <w:proofErr w:type="spellStart"/>
-      <w:r>
-        <w:t>prepara</w:t>
-      </w:r>
-      <w:proofErr w:type="spellEnd"/>
-      <w:r>
-        <w:t xml:space="preserve"> o </w:t>
-      </w:r>
-      <w:proofErr w:type="spellStart"/>
-      <w:r>
-        <w:t>ambiente</w:t>
-      </w:r>
-      <w:proofErr w:type="spellEnd"/>
-      <w:r>
-        <w:t xml:space="preserve"> E2E </w:t>
-      </w:r>
-      <w:proofErr w:type="spellStart"/>
-      <w:r>
-        <w:t>isolado</w:t>
-      </w:r>
-      <w:proofErr w:type="spellEnd"/>
-      <w:r>
-        <w:t>.</w:t>
+        <w:t>Cria e prepara o ambiente E2E isolado.</w:t>
       </w:r>
     </w:p>
     <w:p>
@@ -281,30 +101,7 @@
       <w:proofErr w:type="gramEnd"/>
       <w:r>
         <w:br/>
-      </w:r>
-      <w:proofErr w:type="spellStart"/>
-      <w:r>
-        <w:t>Valida</w:t>
-      </w:r>
-      <w:proofErr w:type="spellEnd"/>
-      <w:r>
-        <w:t xml:space="preserve"> a </w:t>
-      </w:r>
-      <w:proofErr w:type="spellStart"/>
-      <w:r>
-        <w:t>configuração</w:t>
-      </w:r>
-      <w:proofErr w:type="spellEnd"/>
-      <w:r>
-        <w:t xml:space="preserve"> do </w:t>
-      </w:r>
-      <w:proofErr w:type="spellStart"/>
-      <w:r>
-        <w:t>ambiente</w:t>
-      </w:r>
-      <w:proofErr w:type="spellEnd"/>
-      <w:r>
-        <w:t xml:space="preserve"> E2E.</w:t>
+        <w:t>Valida a configuração do ambiente E2E.</w:t>
       </w:r>
     </w:p>
     <w:p>
@@ -332,41 +129,16 @@
       <w:proofErr w:type="gramEnd"/>
       <w:r>
         <w:br/>
-      </w:r>
-      <w:proofErr w:type="spellStart"/>
-      <w:r>
-        <w:t>Executa</w:t>
-      </w:r>
-      <w:proofErr w:type="spellEnd"/>
-      <w:r>
-        <w:t xml:space="preserve"> o smoke test </w:t>
-      </w:r>
-      <w:proofErr w:type="spellStart"/>
-      <w:r>
-        <w:t>em</w:t>
-      </w:r>
-      <w:proofErr w:type="spellEnd"/>
-      <w:r>
-        <w:t xml:space="preserve"> </w:t>
-      </w:r>
-      <w:proofErr w:type="spellStart"/>
-      <w:r>
-        <w:t>todas</w:t>
-      </w:r>
-      <w:proofErr w:type="spellEnd"/>
-      <w:r>
-        <w:t xml:space="preserve"> as ferramentas.</w:t>
+        <w:t>Executa o smoke test em todas as ferramentas.</w:t>
       </w:r>
     </w:p>
     <w:p>
       <w:pPr>
         <w:pStyle w:val="Ttulo2"/>
       </w:pPr>
-      <w:proofErr w:type="spellStart"/>
       <w:r>
         <w:t>Cenários</w:t>
       </w:r>
-      <w:proofErr w:type="spellEnd"/>
     </w:p>
     <w:p>
       <w:r>
@@ -385,65 +157,16 @@
       <w:proofErr w:type="gramEnd"/>
       <w:r>
         <w:br/>
-      </w:r>
-      <w:proofErr w:type="spellStart"/>
-      <w:r>
-        <w:t>Executa</w:t>
-      </w:r>
-      <w:proofErr w:type="spellEnd"/>
-      <w:r>
-        <w:t xml:space="preserve"> </w:t>
-      </w:r>
-      <w:proofErr w:type="spellStart"/>
-      <w:r>
-        <w:t>os</w:t>
-      </w:r>
-      <w:proofErr w:type="spellEnd"/>
-      <w:r>
-        <w:t xml:space="preserve"> </w:t>
-      </w:r>
-      <w:proofErr w:type="spellStart"/>
-      <w:r>
-        <w:t>cenários</w:t>
-      </w:r>
-      <w:proofErr w:type="spellEnd"/>
-      <w:r>
-        <w:t xml:space="preserve"> </w:t>
-      </w:r>
-      <w:proofErr w:type="spellStart"/>
-      <w:r>
-        <w:t>válidos</w:t>
-      </w:r>
-      <w:proofErr w:type="spellEnd"/>
-      <w:r>
-        <w:t xml:space="preserve"> e </w:t>
-      </w:r>
-      <w:proofErr w:type="spellStart"/>
-      <w:r>
-        <w:t>inválidos</w:t>
-      </w:r>
-      <w:proofErr w:type="spellEnd"/>
-      <w:r>
-        <w:t xml:space="preserve"> </w:t>
-      </w:r>
-      <w:proofErr w:type="spellStart"/>
-      <w:r>
-        <w:t>declarados</w:t>
-      </w:r>
-      <w:proofErr w:type="spellEnd"/>
-      <w:r>
-        <w:t>.</w:t>
+        <w:t>Executa os cenários válidos e inválidos declarados.</w:t>
       </w:r>
     </w:p>
     <w:p>
       <w:pPr>
         <w:pStyle w:val="Ttulo2"/>
       </w:pPr>
-      <w:proofErr w:type="spellStart"/>
       <w:r>
         <w:t>Cobertura</w:t>
       </w:r>
-      <w:proofErr w:type="spellEnd"/>
     </w:p>
     <w:p>
       <w:r>
@@ -462,30 +185,7 @@
       <w:proofErr w:type="gramEnd"/>
       <w:r>
         <w:br/>
-      </w:r>
-      <w:proofErr w:type="spellStart"/>
-      <w:r>
-        <w:t>Verifica</w:t>
-      </w:r>
-      <w:proofErr w:type="spellEnd"/>
-      <w:r>
-        <w:t xml:space="preserve"> </w:t>
-      </w:r>
-      <w:proofErr w:type="spellStart"/>
-      <w:r>
-        <w:t>cobertura</w:t>
-      </w:r>
-      <w:proofErr w:type="spellEnd"/>
-      <w:r>
-        <w:t xml:space="preserve"> </w:t>
-      </w:r>
-      <w:proofErr w:type="spellStart"/>
-      <w:r>
-        <w:t>mínima</w:t>
-      </w:r>
-      <w:proofErr w:type="spellEnd"/>
-      <w:r>
-        <w:t xml:space="preserve"> das 32 ferramentas.</w:t>
+        <w:t>Verifica cobertura mínima das 32 ferramentas.</w:t>
       </w:r>
     </w:p>
     <w:p>
@@ -513,25 +213,16 @@
       <w:proofErr w:type="gramEnd"/>
       <w:r>
         <w:br/>
-      </w:r>
-      <w:proofErr w:type="spellStart"/>
-      <w:r>
-        <w:t>Valida</w:t>
-      </w:r>
-      <w:proofErr w:type="spellEnd"/>
-      <w:r>
-        <w:t xml:space="preserve"> downloads (PDF, XLSX, CSV, DOCX e ZIP).</w:t>
+        <w:t>Valida downloads (PDF, XLSX, CSV, DOCX e ZIP).</w:t>
       </w:r>
     </w:p>
     <w:p>
       <w:pPr>
         <w:pStyle w:val="Ttulo2"/>
       </w:pPr>
-      <w:proofErr w:type="spellStart"/>
       <w:r>
         <w:t>Acesso</w:t>
       </w:r>
-      <w:proofErr w:type="spellEnd"/>
     </w:p>
     <w:p>
       <w:r>
@@ -550,50 +241,16 @@
       <w:proofErr w:type="gramEnd"/>
       <w:r>
         <w:br/>
-        <w:t xml:space="preserve">Testa </w:t>
-      </w:r>
-      <w:proofErr w:type="spellStart"/>
-      <w:r>
-        <w:t>visitantes</w:t>
-      </w:r>
-      <w:proofErr w:type="spellEnd"/>
-      <w:r>
-        <w:t xml:space="preserve">, </w:t>
-      </w:r>
-      <w:proofErr w:type="spellStart"/>
-      <w:r>
-        <w:t>usuários</w:t>
-      </w:r>
-      <w:proofErr w:type="spellEnd"/>
-      <w:r>
-        <w:t xml:space="preserve"> </w:t>
-      </w:r>
-      <w:proofErr w:type="spellStart"/>
-      <w:r>
-        <w:t>gratuitos</w:t>
-      </w:r>
-      <w:proofErr w:type="spellEnd"/>
-      <w:r>
-        <w:t xml:space="preserve">, Plus e </w:t>
-      </w:r>
-      <w:proofErr w:type="spellStart"/>
-      <w:r>
-        <w:t>administradores</w:t>
-      </w:r>
-      <w:proofErr w:type="spellEnd"/>
-      <w:r>
-        <w:t>.</w:t>
+        <w:t>Testa visitantes, usuários gratuitos, Plus e administradores.</w:t>
       </w:r>
     </w:p>
     <w:p>
       <w:pPr>
         <w:pStyle w:val="Ttulo2"/>
       </w:pPr>
-      <w:proofErr w:type="spellStart"/>
       <w:r>
         <w:t>Completo</w:t>
       </w:r>
-      <w:proofErr w:type="spellEnd"/>
     </w:p>
     <w:p>
       <w:r>
@@ -612,50 +269,17 @@
       <w:proofErr w:type="gramEnd"/>
       <w:r>
         <w:br/>
-      </w:r>
-      <w:proofErr w:type="spellStart"/>
-      <w:r>
-        <w:t>Executa</w:t>
-      </w:r>
-      <w:proofErr w:type="spellEnd"/>
-      <w:r>
-        <w:t xml:space="preserve"> </w:t>
-      </w:r>
-      <w:proofErr w:type="spellStart"/>
-      <w:r>
-        <w:t>toda</w:t>
-      </w:r>
-      <w:proofErr w:type="spellEnd"/>
-      <w:r>
-        <w:t xml:space="preserve"> a </w:t>
-      </w:r>
-      <w:proofErr w:type="spellStart"/>
-      <w:r>
-        <w:t>suíte</w:t>
-      </w:r>
-      <w:proofErr w:type="spellEnd"/>
-      <w:r>
-        <w:t xml:space="preserve"> </w:t>
-      </w:r>
-      <w:proofErr w:type="spellStart"/>
-      <w:r>
-        <w:t>determinística</w:t>
-      </w:r>
-      <w:proofErr w:type="spellEnd"/>
-      <w:r>
-        <w:t>.</w:t>
+        <w:t>Executa toda a suíte determinística.</w:t>
       </w:r>
     </w:p>
     <w:p>
       <w:pPr>
         <w:pStyle w:val="Ttulo2"/>
       </w:pPr>
-      <w:proofErr w:type="spellStart"/>
       <w:r>
         <w:lastRenderedPageBreak/>
         <w:t>Exploratório</w:t>
       </w:r>
-      <w:proofErr w:type="spellEnd"/>
     </w:p>
     <w:p>
       <w:r>
@@ -674,41 +298,16 @@
       <w:proofErr w:type="gramEnd"/>
       <w:r>
         <w:br/>
-      </w:r>
-      <w:proofErr w:type="spellStart"/>
-      <w:r>
-        <w:t>Executa</w:t>
-      </w:r>
-      <w:proofErr w:type="spellEnd"/>
-      <w:r>
-        <w:t xml:space="preserve"> testes </w:t>
-      </w:r>
-      <w:proofErr w:type="spellStart"/>
-      <w:r>
-        <w:t>exploratórios</w:t>
-      </w:r>
-      <w:proofErr w:type="spellEnd"/>
-      <w:r>
-        <w:t xml:space="preserve"> </w:t>
-      </w:r>
-      <w:proofErr w:type="spellStart"/>
-      <w:r>
-        <w:t>controlados</w:t>
-      </w:r>
-      <w:proofErr w:type="spellEnd"/>
-      <w:r>
-        <w:t>.</w:t>
+        <w:t>Executa testes exploratórios controlados.</w:t>
       </w:r>
     </w:p>
     <w:p>
       <w:pPr>
         <w:pStyle w:val="Ttulo2"/>
       </w:pPr>
-      <w:proofErr w:type="spellStart"/>
       <w:r>
         <w:t>Governança</w:t>
       </w:r>
-      <w:proofErr w:type="spellEnd"/>
     </w:p>
     <w:p>
       <w:r>
@@ -733,49 +332,16 @@
       </w:r>
       <w:r>
         <w:br/>
-      </w:r>
-      <w:proofErr w:type="spellStart"/>
-      <w:r>
-        <w:t>Verifica</w:t>
-      </w:r>
-      <w:proofErr w:type="spellEnd"/>
-      <w:r>
-        <w:t xml:space="preserve"> </w:t>
-      </w:r>
-      <w:proofErr w:type="spellStart"/>
-      <w:r>
-        <w:t>contratos</w:t>
-      </w:r>
-      <w:proofErr w:type="spellEnd"/>
-      <w:r>
-        <w:t xml:space="preserve"> E2E e </w:t>
-      </w:r>
-      <w:proofErr w:type="spellStart"/>
-      <w:r>
-        <w:t>regras</w:t>
-      </w:r>
-      <w:proofErr w:type="spellEnd"/>
-      <w:r>
-        <w:t xml:space="preserve"> </w:t>
-      </w:r>
-      <w:proofErr w:type="spellStart"/>
-      <w:r>
-        <w:t>arquiteturais</w:t>
-      </w:r>
-      <w:proofErr w:type="spellEnd"/>
-      <w:r>
-        <w:t>.</w:t>
+        <w:t>Verifica contratos E2E e regras arquiteturais.</w:t>
       </w:r>
     </w:p>
     <w:p>
       <w:pPr>
         <w:pStyle w:val="Ttulo2"/>
       </w:pPr>
-      <w:proofErr w:type="spellStart"/>
       <w:r>
         <w:t>Relatórios</w:t>
       </w:r>
-      <w:proofErr w:type="spellEnd"/>
     </w:p>
     <w:p>
       <w:r>
@@ -800,31 +366,7 @@
       </w:r>
       <w:r>
         <w:br/>
-        <w:t xml:space="preserve">Gera </w:t>
-      </w:r>
-      <w:proofErr w:type="spellStart"/>
-      <w:r>
-        <w:t>resumo</w:t>
-      </w:r>
-      <w:proofErr w:type="spellEnd"/>
-      <w:r>
-        <w:t xml:space="preserve"> </w:t>
-      </w:r>
-      <w:proofErr w:type="spellStart"/>
-      <w:r>
-        <w:t>executivo</w:t>
-      </w:r>
-      <w:proofErr w:type="spellEnd"/>
-      <w:r>
-        <w:t xml:space="preserve"> da </w:t>
-      </w:r>
-      <w:proofErr w:type="spellStart"/>
-      <w:r>
-        <w:t>execução</w:t>
-      </w:r>
-      <w:proofErr w:type="spellEnd"/>
-      <w:r>
-        <w:t>.</w:t>
+        <w:t>Gera resumo executivo da execução.</w:t>
       </w:r>
     </w:p>
     <w:p>
@@ -844,55 +386,15 @@
       <w:proofErr w:type="gramEnd"/>
       <w:r>
         <w:br/>
-        <w:t xml:space="preserve">Gera </w:t>
-      </w:r>
-      <w:proofErr w:type="spellStart"/>
-      <w:r>
-        <w:t>painel</w:t>
-      </w:r>
-      <w:proofErr w:type="spellEnd"/>
-      <w:r>
-        <w:t xml:space="preserve"> de </w:t>
-      </w:r>
-      <w:proofErr w:type="spellStart"/>
-      <w:r>
-        <w:t>cobertura</w:t>
-      </w:r>
-      <w:proofErr w:type="spellEnd"/>
-      <w:r>
-        <w:t xml:space="preserve"> e </w:t>
-      </w:r>
-      <w:proofErr w:type="spellStart"/>
-      <w:r>
-        <w:t>saúde</w:t>
-      </w:r>
-      <w:proofErr w:type="spellEnd"/>
-      <w:r>
-        <w:t xml:space="preserve"> da </w:t>
-      </w:r>
-      <w:proofErr w:type="spellStart"/>
-      <w:r>
-        <w:t>suíte</w:t>
-      </w:r>
-      <w:proofErr w:type="spellEnd"/>
-      <w:r>
-        <w:t>.</w:t>
+        <w:t>Gera painel de cobertura e saúde da suíte.</w:t>
       </w:r>
     </w:p>
     <w:p>
-      <w:proofErr w:type="spellStart"/>
       <w:r>
         <w:rPr>
           <w:b/>
         </w:rPr>
-        <w:t>npm</w:t>
-      </w:r>
-      <w:proofErr w:type="spellEnd"/>
-      <w:r>
-        <w:rPr>
-          <w:b/>
-        </w:rPr>
-        <w:t xml:space="preserve"> run e2</w:t>
+        <w:t>npm run e2</w:t>
       </w:r>
       <w:proofErr w:type="gramStart"/>
       <w:r>
@@ -904,15 +406,7 @@
       <w:proofErr w:type="gramEnd"/>
       <w:r>
         <w:br/>
-        <w:t xml:space="preserve">Abre o </w:t>
-      </w:r>
-      <w:proofErr w:type="spellStart"/>
-      <w:r>
-        <w:t>relatório</w:t>
-      </w:r>
-      <w:proofErr w:type="spellEnd"/>
-      <w:r>
-        <w:t xml:space="preserve"> HTML do Playwright.</w:t>
+        <w:t>Abre o relatório HTML do Playwright.</w:t>
       </w:r>
     </w:p>
     <w:p>
@@ -924,19 +418,11 @@
       </w:r>
     </w:p>
     <w:p>
-      <w:proofErr w:type="spellStart"/>
       <w:r>
         <w:rPr>
           <w:b/>
         </w:rPr>
-        <w:t>npm</w:t>
-      </w:r>
-      <w:proofErr w:type="spellEnd"/>
-      <w:r>
-        <w:rPr>
-          <w:b/>
-        </w:rPr>
-        <w:t xml:space="preserve"> run e2e:</w:t>
+        <w:t>npm run e2e:</w:t>
       </w:r>
       <w:proofErr w:type="gramStart"/>
       <w:r>
@@ -948,54 +434,15 @@
       <w:proofErr w:type="gramEnd"/>
       <w:r>
         <w:br/>
-      </w:r>
-      <w:proofErr w:type="spellStart"/>
-      <w:r>
-        <w:t>Executa</w:t>
-      </w:r>
-      <w:proofErr w:type="spellEnd"/>
-      <w:r>
-        <w:t xml:space="preserve"> </w:t>
-      </w:r>
-      <w:proofErr w:type="spellStart"/>
-      <w:r>
-        <w:t>os</w:t>
-      </w:r>
-      <w:proofErr w:type="spellEnd"/>
-      <w:r>
-        <w:t xml:space="preserve"> testes </w:t>
-      </w:r>
-      <w:proofErr w:type="spellStart"/>
-      <w:r>
-        <w:t>mostrando</w:t>
-      </w:r>
-      <w:proofErr w:type="spellEnd"/>
-      <w:r>
-        <w:t xml:space="preserve"> o </w:t>
-      </w:r>
-      <w:proofErr w:type="spellStart"/>
-      <w:r>
-        <w:t>navegador</w:t>
-      </w:r>
-      <w:proofErr w:type="spellEnd"/>
-      <w:r>
-        <w:t>.</w:t>
+        <w:t>Executa os testes mostrando o navegador.</w:t>
       </w:r>
     </w:p>
     <w:p>
-      <w:proofErr w:type="spellStart"/>
       <w:r>
         <w:rPr>
           <w:b/>
         </w:rPr>
-        <w:t>npm</w:t>
-      </w:r>
-      <w:proofErr w:type="spellEnd"/>
-      <w:r>
-        <w:rPr>
-          <w:b/>
-        </w:rPr>
-        <w:t xml:space="preserve"> run e2e:</w:t>
+        <w:t>npm run e2e:</w:t>
       </w:r>
       <w:proofErr w:type="gramStart"/>
       <w:r>
@@ -1007,62 +454,28 @@
       <w:proofErr w:type="gramEnd"/>
       <w:r>
         <w:br/>
-        <w:t xml:space="preserve">Abre o Playwright Inspector para </w:t>
-      </w:r>
-      <w:proofErr w:type="spellStart"/>
-      <w:r>
-        <w:t>depuração</w:t>
-      </w:r>
-      <w:proofErr w:type="spellEnd"/>
-      <w:r>
-        <w:t>.</w:t>
+        <w:t>Abre o Playwright Inspector para depuração.</w:t>
       </w:r>
     </w:p>
     <w:p>
-      <w:proofErr w:type="spellStart"/>
       <w:r>
         <w:rPr>
           <w:b/>
         </w:rPr>
-        <w:t>npx</w:t>
-      </w:r>
-      <w:proofErr w:type="spellEnd"/>
-      <w:r>
-        <w:rPr>
-          <w:b/>
-        </w:rPr>
-        <w:t xml:space="preserve"> playwright show-trace &lt;trace.zip&gt;</w:t>
+        <w:t>npx playwright show-trace &lt;trace.zip&gt;</w:t>
       </w:r>
       <w:r>
         <w:br/>
-        <w:t xml:space="preserve">Abre um trace de </w:t>
-      </w:r>
-      <w:proofErr w:type="spellStart"/>
-      <w:r>
-        <w:t>uma</w:t>
-      </w:r>
-      <w:proofErr w:type="spellEnd"/>
-      <w:r>
-        <w:t xml:space="preserve"> </w:t>
-      </w:r>
-      <w:proofErr w:type="spellStart"/>
-      <w:r>
-        <w:t>execução</w:t>
-      </w:r>
-      <w:proofErr w:type="spellEnd"/>
-      <w:r>
-        <w:t>.</w:t>
+        <w:t>Abre um trace de uma execução.</w:t>
       </w:r>
     </w:p>
     <w:p>
       <w:pPr>
         <w:pStyle w:val="Ttulo2"/>
       </w:pPr>
-      <w:proofErr w:type="spellStart"/>
       <w:r>
         <w:t>Limpeza</w:t>
       </w:r>
-      <w:proofErr w:type="spellEnd"/>
     </w:p>
     <w:p>
       <w:r>
@@ -1081,23 +494,7 @@
       <w:proofErr w:type="gramEnd"/>
       <w:r>
         <w:br/>
-        <w:t xml:space="preserve">Remove </w:t>
-      </w:r>
-      <w:proofErr w:type="spellStart"/>
-      <w:r>
-        <w:t>artefatos</w:t>
-      </w:r>
-      <w:proofErr w:type="spellEnd"/>
-      <w:r>
-        <w:t xml:space="preserve"> e limpa o </w:t>
-      </w:r>
-      <w:proofErr w:type="spellStart"/>
-      <w:r>
-        <w:t>ambiente</w:t>
-      </w:r>
-      <w:proofErr w:type="spellEnd"/>
-      <w:r>
-        <w:t xml:space="preserve"> E2E.</w:t>
+        <w:t>Remove artefatos e limpa o ambiente E2E.</w:t>
       </w:r>
     </w:p>
     <w:p/>
@@ -1115,24 +512,14 @@
     <w:p/>
     <w:p/>
     <w:p>
-      <w:proofErr w:type="spellStart"/>
       <w:r>
         <w:lastRenderedPageBreak/>
-        <w:t>npm</w:t>
-      </w:r>
-      <w:proofErr w:type="spellEnd"/>
-      <w:r>
-        <w:t xml:space="preserve"> install</w:t>
+        <w:t>npm install</w:t>
       </w:r>
     </w:p>
     <w:p>
-      <w:proofErr w:type="spellStart"/>
       <w:r>
-        <w:t>npm</w:t>
-      </w:r>
-      <w:proofErr w:type="spellEnd"/>
-      <w:r>
-        <w:t xml:space="preserve"> run e2</w:t>
+        <w:t>npm run e2</w:t>
       </w:r>
       <w:proofErr w:type="gramStart"/>
       <w:r>
@@ -1146,111 +533,55 @@
     <w:p/>
     <w:p>
       <w:r>
-        <w:t>composer e2</w:t>
+        <w:t>composer e2e:prepare</w:t>
       </w:r>
-      <w:proofErr w:type="gramStart"/>
-      <w:r>
-        <w:t>e:prepare</w:t>
-      </w:r>
-      <w:proofErr w:type="gramEnd"/>
     </w:p>
     <w:p>
       <w:r>
-        <w:t>composer e2</w:t>
+        <w:t>composer e2e:verify</w:t>
       </w:r>
-      <w:proofErr w:type="gramStart"/>
-      <w:r>
-        <w:t>e:verify</w:t>
-      </w:r>
-      <w:proofErr w:type="gramEnd"/>
     </w:p>
     <w:p>
       <w:r>
-        <w:t>composer e2</w:t>
-      </w:r>
-      <w:proofErr w:type="gramStart"/>
-      <w:r>
-        <w:t>e:governance</w:t>
-      </w:r>
-      <w:proofErr w:type="gramEnd"/>
-      <w:r>
-        <w:t>:check</w:t>
+        <w:t>composer e2e:governance:check</w:t>
       </w:r>
     </w:p>
     <w:p/>
     <w:p>
       <w:r>
-        <w:t>composer e2e:</w:t>
+        <w:t>composer e2e:browser:smoke</w:t>
       </w:r>
-      <w:proofErr w:type="gramStart"/>
-      <w:r>
-        <w:t>browser:smoke</w:t>
-      </w:r>
-      <w:proofErr w:type="gramEnd"/>
     </w:p>
     <w:p>
       <w:r>
-        <w:t>composer e2e:</w:t>
+        <w:t>composer e2e:browser:scenarios</w:t>
       </w:r>
-      <w:proofErr w:type="gramStart"/>
-      <w:r>
-        <w:t>browser:scenarios</w:t>
-      </w:r>
-      <w:proofErr w:type="gramEnd"/>
     </w:p>
     <w:p>
       <w:r>
-        <w:t>composer e2e:</w:t>
+        <w:t>composer e2e:browser:downloads</w:t>
       </w:r>
-      <w:proofErr w:type="gramStart"/>
-      <w:r>
-        <w:t>browser:downloads</w:t>
-      </w:r>
-      <w:proofErr w:type="gramEnd"/>
     </w:p>
     <w:p>
       <w:r>
-        <w:t>composer e2e:</w:t>
+        <w:t>composer e2e:browser:access</w:t>
       </w:r>
-      <w:proofErr w:type="gramStart"/>
-      <w:r>
-        <w:t>browser:access</w:t>
-      </w:r>
-      <w:proofErr w:type="gramEnd"/>
     </w:p>
     <w:p>
       <w:r>
-        <w:t>composer e2e:</w:t>
+        <w:t>composer e2e:browser:complete</w:t>
       </w:r>
-      <w:proofErr w:type="gramStart"/>
-      <w:r>
-        <w:t>browser:complete</w:t>
-      </w:r>
-      <w:proofErr w:type="gramEnd"/>
     </w:p>
     <w:p/>
     <w:p>
       <w:r>
-        <w:t>composer e2</w:t>
-      </w:r>
-      <w:proofErr w:type="gramStart"/>
-      <w:r>
-        <w:t>e:report</w:t>
-      </w:r>
-      <w:proofErr w:type="gramEnd"/>
-      <w:r>
-        <w:t>:summary</w:t>
+        <w:t>composer e2e:report:summary</w:t>
       </w:r>
     </w:p>
     <w:p>
       <w:r>
-        <w:t>composer e2</w:t>
+        <w:t>composer e2e:dashboard</w:t>
       </w:r>
-      <w:proofErr w:type="gramStart"/>
-      <w:r>
-        <w:t>e:dashboard</w:t>
-      </w:r>
-      <w:proofErr w:type="gramEnd"/>
     </w:p>
     <w:p>
       <w:pPr>
@@ -1258,19 +589,9 @@
           <w:u w:val="single"/>
         </w:rPr>
       </w:pPr>
-      <w:proofErr w:type="spellStart"/>
       <w:r>
-        <w:t>npm</w:t>
+        <w:t>npm run e2e:report</w:t>
       </w:r>
-      <w:proofErr w:type="spellEnd"/>
-      <w:r>
-        <w:t xml:space="preserve"> run e2</w:t>
-      </w:r>
-      <w:proofErr w:type="gramStart"/>
-      <w:r>
-        <w:t>e:report</w:t>
-      </w:r>
-      <w:proofErr w:type="gramEnd"/>
     </w:p>
     <w:p>
       <w:pPr>
@@ -1292,61 +613,11 @@
           <w:u w:val="single"/>
         </w:rPr>
       </w:pPr>
-      <w:proofErr w:type="spellStart"/>
       <w:r>
         <w:rPr>
           <w:u w:val="single"/>
         </w:rPr>
-        <w:t>Quando</w:t>
-      </w:r>
-      <w:proofErr w:type="spellEnd"/>
-      <w:r>
-        <w:rPr>
-          <w:u w:val="single"/>
-        </w:rPr>
-        <w:t xml:space="preserve"> </w:t>
-      </w:r>
-      <w:proofErr w:type="spellStart"/>
-      <w:r>
-        <w:rPr>
-          <w:u w:val="single"/>
-        </w:rPr>
-        <w:t>terminar</w:t>
-      </w:r>
-      <w:proofErr w:type="spellEnd"/>
-      <w:r>
-        <w:rPr>
-          <w:u w:val="single"/>
-        </w:rPr>
-        <w:t xml:space="preserve">, </w:t>
-      </w:r>
-      <w:proofErr w:type="spellStart"/>
-      <w:r>
-        <w:rPr>
-          <w:u w:val="single"/>
-        </w:rPr>
-        <w:t>limpe</w:t>
-      </w:r>
-      <w:proofErr w:type="spellEnd"/>
-      <w:r>
-        <w:rPr>
-          <w:u w:val="single"/>
-        </w:rPr>
-        <w:t xml:space="preserve"> o </w:t>
-      </w:r>
-      <w:proofErr w:type="spellStart"/>
-      <w:r>
-        <w:rPr>
-          <w:u w:val="single"/>
-        </w:rPr>
-        <w:t>ambiente</w:t>
-      </w:r>
-      <w:proofErr w:type="spellEnd"/>
-      <w:r>
-        <w:rPr>
-          <w:u w:val="single"/>
-        </w:rPr>
-        <w:t xml:space="preserve"> E2E com:</w:t>
+        <w:t>Quando terminar, limpe o ambiente E2E com:</w:t>
       </w:r>
     </w:p>
     <w:p>
@@ -1359,16 +630,8 @@
         <w:rPr>
           <w:u w:val="single"/>
         </w:rPr>
-        <w:t>composer e2</w:t>
+        <w:t>composer e2e:clean</w:t>
       </w:r>
-      <w:proofErr w:type="gramStart"/>
-      <w:r>
-        <w:rPr>
-          <w:u w:val="single"/>
-        </w:rPr>
-        <w:t>e:clean</w:t>
-      </w:r>
-      <w:proofErr w:type="gramEnd"/>
     </w:p>
     <w:p>
       <w:pPr>
@@ -1383,61 +646,11 @@
           <w:u w:val="single"/>
         </w:rPr>
       </w:pPr>
-      <w:proofErr w:type="spellStart"/>
       <w:r>
         <w:rPr>
           <w:u w:val="single"/>
         </w:rPr>
-        <w:t>testa</w:t>
-      </w:r>
-      <w:proofErr w:type="spellEnd"/>
-      <w:r>
-        <w:rPr>
-          <w:u w:val="single"/>
-        </w:rPr>
-        <w:t xml:space="preserve"> </w:t>
-      </w:r>
-      <w:proofErr w:type="spellStart"/>
-      <w:r>
-        <w:rPr>
-          <w:u w:val="single"/>
-        </w:rPr>
-        <w:t>diretamente</w:t>
-      </w:r>
-      <w:proofErr w:type="spellEnd"/>
-      <w:r>
-        <w:rPr>
-          <w:u w:val="single"/>
-        </w:rPr>
-        <w:t xml:space="preserve"> </w:t>
-      </w:r>
-      <w:proofErr w:type="spellStart"/>
-      <w:r>
-        <w:rPr>
-          <w:u w:val="single"/>
-        </w:rPr>
-        <w:t>os</w:t>
-      </w:r>
-      <w:proofErr w:type="spellEnd"/>
-      <w:r>
-        <w:rPr>
-          <w:u w:val="single"/>
-        </w:rPr>
-        <w:t xml:space="preserve"> </w:t>
-      </w:r>
-      <w:proofErr w:type="spellStart"/>
-      <w:r>
-        <w:rPr>
-          <w:u w:val="single"/>
-        </w:rPr>
-        <w:t>btn</w:t>
-      </w:r>
-      <w:proofErr w:type="spellEnd"/>
-      <w:r>
-        <w:rPr>
-          <w:u w:val="single"/>
-        </w:rPr>
-        <w:t xml:space="preserve"> dos form</w:t>
+        <w:t>testa diretamente os btn dos form</w:t>
       </w:r>
     </w:p>
     <w:p>
@@ -1446,99 +659,19 @@
           <w:u w:val="single"/>
         </w:rPr>
       </w:pPr>
-      <w:proofErr w:type="spellStart"/>
       <w:r>
         <w:rPr>
           <w:u w:val="single"/>
         </w:rPr>
-        <w:t>npm</w:t>
+        <w:t>npm run e2e:test:actions</w:t>
       </w:r>
-      <w:proofErr w:type="spellEnd"/>
+    </w:p>
+    <w:p>
       <w:r>
         <w:rPr>
           <w:u w:val="single"/>
         </w:rPr>
-        <w:t xml:space="preserve"> run e2e:</w:t>
-      </w:r>
-      <w:proofErr w:type="gramStart"/>
-      <w:r>
-        <w:rPr>
-          <w:u w:val="single"/>
-        </w:rPr>
-        <w:t>test:actions</w:t>
-      </w:r>
-      <w:proofErr w:type="gramEnd"/>
-    </w:p>
-    <w:p>
-      <w:proofErr w:type="spellStart"/>
-      <w:r>
-        <w:rPr>
-          <w:u w:val="single"/>
-        </w:rPr>
-        <w:t>mesma</w:t>
-      </w:r>
-      <w:proofErr w:type="spellEnd"/>
-      <w:r>
-        <w:rPr>
-          <w:u w:val="single"/>
-        </w:rPr>
-        <w:t xml:space="preserve"> </w:t>
-      </w:r>
-      <w:proofErr w:type="spellStart"/>
-      <w:r>
-        <w:rPr>
-          <w:u w:val="single"/>
-        </w:rPr>
-        <w:t>coisa</w:t>
-      </w:r>
-      <w:proofErr w:type="spellEnd"/>
-      <w:r>
-        <w:rPr>
-          <w:u w:val="single"/>
-        </w:rPr>
-        <w:t xml:space="preserve"> </w:t>
-      </w:r>
-      <w:proofErr w:type="spellStart"/>
-      <w:r>
-        <w:rPr>
-          <w:u w:val="single"/>
-        </w:rPr>
-        <w:t>só</w:t>
-      </w:r>
-      <w:proofErr w:type="spellEnd"/>
-      <w:r>
-        <w:rPr>
-          <w:u w:val="single"/>
-        </w:rPr>
-        <w:t xml:space="preserve"> que </w:t>
-      </w:r>
-      <w:proofErr w:type="spellStart"/>
-      <w:r>
-        <w:rPr>
-          <w:u w:val="single"/>
-        </w:rPr>
-        <w:t>testa</w:t>
-      </w:r>
-      <w:proofErr w:type="spellEnd"/>
-      <w:r>
-        <w:rPr>
-          <w:u w:val="single"/>
-        </w:rPr>
-        <w:t xml:space="preserve"> </w:t>
-      </w:r>
-      <w:proofErr w:type="spellStart"/>
-      <w:r>
-        <w:rPr>
-          <w:u w:val="single"/>
-        </w:rPr>
-        <w:t>pelo</w:t>
-      </w:r>
-      <w:proofErr w:type="spellEnd"/>
-      <w:r>
-        <w:rPr>
-          <w:u w:val="single"/>
-        </w:rPr>
-        <w:t xml:space="preserve"> slug</w:t>
+        <w:t>mesma coisa só que testa pelo slug</w:t>
       </w:r>
     </w:p>
     <w:p>
@@ -1547,56 +680,33 @@
           <w:u w:val="single"/>
         </w:rPr>
       </w:pPr>
-      <w:proofErr w:type="spellStart"/>
       <w:r>
         <w:rPr>
           <w:u w:val="single"/>
         </w:rPr>
-        <w:t>npm</w:t>
+        <w:t>npm run e2e:test:tool gerador-de-contratos</w:t>
       </w:r>
-      <w:proofErr w:type="spellEnd"/>
+    </w:p>
+    <w:p>
+      <w:pPr>
+        <w:rPr>
+          <w:u w:val="single"/>
+        </w:rPr>
+      </w:pPr>
+    </w:p>
+    <w:p>
+      <w:pPr>
+        <w:rPr>
+          <w:u w:val="single"/>
+        </w:rPr>
+      </w:pPr>
       <w:r>
         <w:rPr>
           <w:u w:val="single"/>
         </w:rPr>
-        <w:t xml:space="preserve"> run e2e:</w:t>
+        <w:lastRenderedPageBreak/>
+        <w:t>php artisan test</w:t>
       </w:r>
-      <w:proofErr w:type="gramStart"/>
-      <w:r>
-        <w:rPr>
-          <w:u w:val="single"/>
-        </w:rPr>
-        <w:t>test:tool</w:t>
-      </w:r>
-      <w:proofErr w:type="gramEnd"/>
-      <w:r>
-        <w:rPr>
-          <w:u w:val="single"/>
-        </w:rPr>
-        <w:t xml:space="preserve"> </w:t>
-      </w:r>
-      <w:proofErr w:type="spellStart"/>
-      <w:r>
-        <w:rPr>
-          <w:u w:val="single"/>
-        </w:rPr>
-        <w:t>gerador</w:t>
-      </w:r>
-      <w:proofErr w:type="spellEnd"/>
-      <w:r>
-        <w:rPr>
-          <w:u w:val="single"/>
-        </w:rPr>
-        <w:t>-de-</w:t>
-      </w:r>
-      <w:proofErr w:type="spellStart"/>
-      <w:r>
-        <w:rPr>
-          <w:u w:val="single"/>
-        </w:rPr>
-        <w:t>contratos</w:t>
-      </w:r>
-      <w:proofErr w:type="spellEnd"/>
     </w:p>
     <w:p>
       <w:pPr>

</xml_diff>